<commit_message>
Update IRB #1: make all interviews Zoom-only
Remove all "or in person" language from the protocol. Interviews are now
consistently described as conducted online on Zoom across Section 2
(Methods), Section 6 (Confidentiality), Appendix D (Interview consent),
and Appendix F (Recruitment texts). Handheld-recorder references removed
from confidentiality sections since they no longer apply.

Co-Authored-By: Claude Opus 4.6 <noreply@anthropic.com>
Claude-Session: https://claude.ai/code/session_01Stxx1PvZ7fDipzAMKApSS3
</commit_message>
<xml_diff>
--- a/irb1-reflection-groups/CURRENT/IRB1_Outside_Class_Reflection_FINAL.docx
+++ b/irb1-reflection-groups/CURRENT/IRB1_Outside_Class_Reflection_FINAL.docx
@@ -212,7 +212,7 @@
     <w:p>
       <w:pPr/>
       <w:r>
-        <w:t>8. Interviews. A purposeful subset of members is invited to confidential individual interviews about their experiences, professional-skill behaviors, and changes over time. Interviews are one-to-one; there are no group interviews. Each takes approximately 30–60 minutes and is conducted online on Zoom or in person, based on the member’s preference and researcher availability. With the member’s agreement the interview is audio-recorded; where a member prefers not to be recorded, the interviewer takes notes instead. No video is recorded. The interview guide is in Appendix E. For each interview completed, the participant is entered into a raffle for a $25 gift card (Section 9).</w:t>
+        <w:t>8. Interviews. A purposeful subset of members is invited to confidential individual interviews about their experiences, professional-skill behaviors, and changes over time. Interviews are one-to-one; there are no group interviews. Each takes approximately 30–60 minutes and is conducted online on Zoom. With the member’s agreement the interview is audio-recorded; where a member prefers not to be recorded, the interviewer takes notes instead. No video is recorded. The interview guide is in Appendix E. For each interview completed, the participant is entered into a raffle for a $25 gift card (Section 9).</w:t>
       </w:r>
     </w:p>
     <w:p>
@@ -592,7 +592,7 @@
     <w:p>
       <w:pPr/>
       <w:r>
-        <w:t>Interviews are conducted online (Zoom) or in person. Recordings of online interviews are removed from Zoom within 72 hours and stored on the secure cloud storage platform; recordings made on a handheld recorder for in-person interviews are removed from the device within 72 hours and stored in the same location. The PI or a named researcher transcribes the recordings; no external transcription service is used. Notes and transcripts are stored on the secure cloud storage platform with identifiers replaced by the participant’s key.</w:t>
+        <w:t>Interviews are conducted online on Zoom. Recordings are removed from Zoom within 72 hours and stored on the secure cloud storage platform. The PI or a named researcher transcribes the recordings; no external transcription service is used. Notes and transcripts are stored on the secure cloud storage platform with identifiers replaced by the participant’s key.</w:t>
       </w:r>
     </w:p>
     <w:p>
@@ -1543,7 +1543,7 @@
         <w:pStyle w:val="ListBullet"/>
       </w:pPr>
       <w:r>
-        <w:t>Take part in a one-to-one interview about your experiences in the reflection activities, your professional-skill behaviors, and changes over time. The interview will be 30–60 minutes. It is conducted online (Zoom) or in person, based on your preference and researcher availability, and is audio-recorded with your agreement. If you prefer not to be recorded, the interviewer will take notes instead. No video is recorded.</w:t>
+        <w:t>Take part in a one-to-one interview about your experiences in the reflection activities, your professional-skill behaviors, and changes over time. The interview will be 30–60 minutes. It is conducted online on Zoom and is audio-recorded with your agreement. If you prefer not to be recorded, the interviewer will take notes instead. No video is recorded.</w:t>
       </w:r>
     </w:p>
     <w:p>
@@ -1620,7 +1620,7 @@
     <w:p>
       <w:pPr/>
       <w:r>
-        <w:t>If the interview is online, the recording is taken with the meeting platform’s audio-only recording (Zoom) and removed from that platform within 72 hours. If the interview is in person, the recording is made on a password-protected handheld recorder and removed from that device within 72 hours. Either way, the recording is then stored on the secure cloud storage platform. The PI or a named researcher transcribes the recording; no external transcription service is used.</w:t>
+        <w:t>The recording is taken with Zoom’s audio-only recording and removed from Zoom within 72 hours. The recording is then stored on the secure cloud storage platform. The PI or a named researcher transcribes the recording; no external transcription service is used.</w:t>
       </w:r>
     </w:p>
     <w:p>
@@ -1877,7 +1877,7 @@
     <w:p>
       <w:pPr/>
       <w:r>
-        <w:t>Hello, we are inviting you to take part in a research interview about your experience of the reflection activities, your professional-skill behaviors, and what has changed for you over time, as part of a University of Maine research study. The interview is one-to-one, takes about 30–60 minutes, and is conducted online (Zoom) or in person based on your preference. With your agreement, the interview is audio-recorded; if you would rather not be recorded, the interviewer will take notes instead. No video is recorded. For each interview you complete, you will be entered into a raffle for a $25 electronic VISA gift card. Draws are held [quarterly]. The consent form is attached. If you are interested, please use this link to schedule: [link]. If you have any questions, please reach out to [name] at [email].</w:t>
+        <w:t>Hello, we are inviting you to take part in a research interview about your experience of the reflection activities, your professional-skill behaviors, and what has changed for you over time, as part of a University of Maine research study. The interview is one-to-one, takes about 30–60 minutes, and is conducted online on Zoom. With your agreement, the interview is audio-recorded; if you would rather not be recorded, the interviewer will take notes instead. No video is recorded. For each interview you complete, you will be entered into a raffle for a $25 electronic VISA gift card. Draws are held [quarterly]. The consent form is attached. If you are interested, please use this link to schedule: [link]. If you have any questions, please reach out to [name] at [email].</w:t>
       </w:r>
     </w:p>
     <w:p>

</xml_diff>

<commit_message>
Address remaining ORA review points in IRB #1 protocol
- Delete group-confidentiality paragraphs from Confidentiality (S6) and
  Risks (S7) per ORA instruction that reflection groups are not research
- Add final gift card distribution date (March 2032) to Compensation
- Delete redundant intro paragraph from Appendix C survey instrument
- Soften co-design sessions language in Methods and Appendix A to avoid
  triggering "focus groups" concern

Co-Authored-By: Claude Opus 4.6 <noreply@anthropic.com>
Claude-Session: https://claude.ai/code/session_01Stxx1PvZ7fDipzAMKApSS3
</commit_message>
<xml_diff>
--- a/irb1-reflection-groups/CURRENT/IRB1_Outside_Class_Reflection_FINAL.docx
+++ b/irb1-reflection-groups/CURRENT/IRB1_Outside_Class_Reflection_FINAL.docx
@@ -423,7 +423,7 @@
           <w:color w:val="000000" w:themeColor="text1"/>
         </w:rPr>
         <w:lastRenderedPageBreak/>
-        <w:t>5. Notes and materials from the optional whole-cohort activity held about halfway through a cycle, and from the co-design sessions in which members suggest improvements to the reflection-group designs, both held online.</w:t>
+        <w:t>5. Notes and materials from the optional whole-cohort activity held about halfway through a cycle, and from other group activities, both held online.</w:t>
       </w:r>
     </w:p>
     <w:p>
@@ -1338,21 +1338,6 @@
           <w:rFonts w:cs="Times New Roman"/>
           <w:color w:val="000000" w:themeColor="text1"/>
         </w:rPr>
-        <w:t>Participants in reflection groups are asked to respect the confidentiality of their peers and not share personal information discussed in the groups. However, the researchers cannot guarantee complete confidentiality in the group-based portion of this study, because what members share in a group is heard by other members.</w:t>
-      </w:r>
-    </w:p>
-    <w:p>
-      <w:pPr>
-        <w:rPr>
-          <w:rFonts w:cs="Times New Roman"/>
-          <w:color w:val="000000" w:themeColor="text1"/>
-        </w:rPr>
-      </w:pPr>
-      <w:r>
-        <w:rPr>
-          <w:rFonts w:cs="Times New Roman"/>
-          <w:color w:val="000000" w:themeColor="text1"/>
-        </w:rPr>
         <w:t>Initially, all data will be stored on a secure cloud storage platform that encrypts all data at rest and in transit with AES-256 bit encryption and is password protected. Identifiable data are accessible only to the research personnel named in Section 3.</w:t>
       </w:r>
     </w:p>
@@ -1676,21 +1661,6 @@
           <w:rFonts w:cs="Times New Roman"/>
           <w:color w:val="000000" w:themeColor="text1"/>
         </w:rPr>
-        <w:t xml:space="preserve">Because reflection groups involve sharing among peers, there is a risk that personal information shared in a group could be disclosed by another member; members are asked to respect confidentiality, but it cannot be guaranteed.</w:t>
-      </w:r>
-    </w:p>
-    <w:p>
-      <w:pPr>
-        <w:rPr>
-          <w:rFonts w:cs="Times New Roman"/>
-          <w:color w:val="000000" w:themeColor="text1"/>
-        </w:rPr>
-      </w:pPr>
-      <w:r>
-        <w:rPr>
-          <w:rFonts w:cs="Times New Roman"/>
-          <w:color w:val="000000" w:themeColor="text1"/>
-        </w:rPr>
         <w:t>The consent page at the start of each survey makes clear that any question can be skipped if the participant does not feel comfortable answering, and participants are told the same at the start of an interview.</w:t>
       </w:r>
     </w:p>
@@ -1821,21 +1791,21 @@
           <w:rFonts w:cs="Times New Roman"/>
           <w:color w:val="000000" w:themeColor="text1"/>
         </w:rPr>
-        <w:t xml:space="preserve">Raffle draws are held quarterly, at the end of March, June, September, and December. In each draw, one $10 gift card is awarded </w:t>
-      </w:r>
-      <w:r>
-        <w:rPr>
-          <w:rFonts w:cs="Times New Roman"/>
-          <w:color w:val="000000" w:themeColor="text1"/>
-        </w:rPr>
-        <w:t>for</w:t>
-      </w:r>
-      <w:r>
-        <w:rPr>
-          <w:rFonts w:cs="Times New Roman"/>
-          <w:color w:val="000000" w:themeColor="text1"/>
-        </w:rPr>
-        <w:t xml:space="preserve"> survey entries received since the previous draw, and one $25 gift card for interview entries.</w:t>
+        <w:t xml:space="preserve">Raffle draws are held quarterly, at the end of March, June, September, and December. In each draw, one $10 gift card is awarded for survey entries received since the previous draw, and one $25 gift card for interview entries. Because the last data collection under this protocol is expected no later than 2031, all final gift cards will be distributed by March 2032.</w:t>
+      </w:r>
+      <w:r>
+        <w:rPr>
+          <w:rFonts w:cs="Times New Roman"/>
+          <w:color w:val="000000" w:themeColor="text1"/>
+        </w:rPr>
+        <w:t/>
+      </w:r>
+      <w:r>
+        <w:rPr>
+          <w:rFonts w:cs="Times New Roman"/>
+          <w:color w:val="000000" w:themeColor="text1"/>
+        </w:rPr>
+        <w:t xml:space="preserve"/>
       </w:r>
     </w:p>
     <w:p>
@@ -2104,7 +2074,7 @@
           <w:rFonts w:cs="Times New Roman"/>
           <w:color w:val="000000" w:themeColor="text1"/>
         </w:rPr>
-        <w:t>Notes and materials from whole-cohort activities and from sessions in which members suggest improvements to the reflection groups;</w:t>
+        <w:t>Notes and materials from whole-cohort activities and other group activities;</w:t>
       </w:r>
     </w:p>
     <w:p>
@@ -3043,21 +3013,6 @@
         </w:rPr>
         <w:lastRenderedPageBreak/>
         <w:t>Appendix C: Longitudinal follow-up survey</w:t>
-      </w:r>
-    </w:p>
-    <w:p>
-      <w:pPr>
-        <w:rPr>
-          <w:rFonts w:cs="Times New Roman"/>
-          <w:color w:val="000000" w:themeColor="text1"/>
-        </w:rPr>
-      </w:pPr>
-      <w:r>
-        <w:rPr>
-          <w:rFonts w:cs="Times New Roman"/>
-          <w:color w:val="000000" w:themeColor="text1"/>
-        </w:rPr>
-        <w:t>Please help us understand your experiences over time. Your answers are confidential. There are no right or wrong answers. You may skip any questions you are uncomfortable answering. For each follow-up survey you submit, you will be entered into a raffle for a $10 electronic VISA gift card.</w:t>
       </w:r>
     </w:p>
     <w:p>

</xml_diff>

<commit_message>
Fix review issues: renumber Methods, fix cross-refs, remove stale language
- Renumber Methods items 7/8/9 to 6/7/8 after tool-usage removal
- Fix data-collected summary cross-refs (1.4->1.3, 1.5->1.4)
- Remove tool-usage mention from verbal script in Appendix F
- Update co-design language in data-collected list and interview guide
- Fix run-together emails in Appendix A and B contact sections

Co-Authored-By: Claude Opus 4.6 <noreply@anthropic.com>
Claude-Session: https://claude.ai/code/session_01Stxx1PvZ7fDipzAMKApSS3
</commit_message>
<xml_diff>
--- a/irb1-reflection-groups/CURRENT/IRB1_Outside_Class_Reflection_FINAL.docx
+++ b/irb1-reflection-groups/CURRENT/IRB1_Outside_Class_Reflection_FINAL.docx
@@ -454,22 +454,22 @@
           <w:rFonts w:cs="Times New Roman"/>
           <w:color w:val="000000" w:themeColor="text1"/>
         </w:rPr>
-        <w:t>7. Longitudinal follow-up surveys. Members are invited to confidential follow-up surveys, taken online in Qualtrics, each taking approximately 10–15 minutes. The surveys are confidential rather than anonymous: each response carries the participant’s email address as an identifier, handled as described in Section 6. Invitations are sent at approximately 3 months and 6 months after a member’s group begins, and then approximately every 6 months; each is a separate invitation and a participant may respond to some and not others. The survey questions are in Appendix C. For each follow-up survey submitted, the participant is entered into a raffle for a $10 gift card (Section 9).</w:t>
-      </w:r>
-    </w:p>
-    <w:p>
-      <w:pPr>
-        <w:rPr>
-          <w:rFonts w:cs="Times New Roman"/>
-          <w:color w:val="000000" w:themeColor="text1"/>
-        </w:rPr>
-      </w:pPr>
-      <w:r>
-        <w:rPr>
-          <w:rFonts w:cs="Times New Roman"/>
-          <w:color w:val="000000" w:themeColor="text1"/>
-        </w:rPr>
-        <w:t>8. Interviews. A purposeful subset of members is invited to confidential individual interviews about their experiences, professional-skill behaviors, and changes over time. Interviews are one-to-one; there are no group interviews. Each takes approximately 30–60 minutes and is conducted online on Zoom. With the member’s agreement the interview is audio-recorded; where a member prefers not to be recorded, the interviewer takes notes instead. No video is recorded. The interview guide is in Appendix E. For each interview completed, the participant is entered into a raffle for a $25 gift card (Section 9). A member may be invited to more than one interview over time, and may accept some and decline others.</w:t>
+        <w:t>6. Longitudinal follow-up surveys. Members are invited to confidential follow-up surveys, taken online in Qualtrics, each taking approximately 10–15 minutes. The surveys are confidential rather than anonymous: each response carries the participant’s email address as an identifier, handled as described in Section 6. Invitations are sent at approximately 3 months and 6 months after a member’s group begins, and then approximately every 6 months; each is a separate invitation and a participant may respond to some and not others. The survey questions are in Appendix C. For each follow-up survey submitted, the participant is entered into a raffle for a $10 gift card (Section 9).</w:t>
+      </w:r>
+    </w:p>
+    <w:p>
+      <w:pPr>
+        <w:rPr>
+          <w:rFonts w:cs="Times New Roman"/>
+          <w:color w:val="000000" w:themeColor="text1"/>
+        </w:rPr>
+      </w:pPr>
+      <w:r>
+        <w:rPr>
+          <w:rFonts w:cs="Times New Roman"/>
+          <w:color w:val="000000" w:themeColor="text1"/>
+        </w:rPr>
+        <w:t>7. Interviews. A purposeful subset of members is invited to confidential individual interviews about their experiences, professional-skill behaviors, and changes over time. Interviews are one-to-one; there are no group interviews. Each takes approximately 30–60 minutes and is conducted online on Zoom. With the member’s agreement the interview is audio-recorded; where a member prefers not to be recorded, the interviewer takes notes instead. No video is recorded. The interview guide is in Appendix E. For each interview completed, the participant is entered into a raffle for a $25 gift card (Section 9). A member may be invited to more than one interview over time, and may accept some and decline others.</w:t>
       </w:r>
     </w:p>
     <w:p>
@@ -499,7 +499,7 @@
           <w:rFonts w:cs="Times New Roman"/>
           <w:color w:val="000000" w:themeColor="text1"/>
         </w:rPr>
-        <w:t xml:space="preserve">9. </w:t>
+        <w:t xml:space="preserve">8. Comparison group. For comparative evaluation, the team will separately recruit a comparison group of working professionals for surveys and optional interviews. A modification will be submitted for control group details at a later date to the IRB for review and approval prior to any recruitment for this group beginning.</w:t>
       </w:r>
       <w:commentRangeStart w:id="0"/>
       <w:r>
@@ -507,7 +507,7 @@
           <w:rFonts w:cs="Times New Roman"/>
           <w:color w:val="000000" w:themeColor="text1"/>
         </w:rPr>
-        <w:t>Comparison group. For comparative evaluation, the team will separately recruit a comparison group of working professionals for surveys and optional interviews. A modification will be submitted for control group details at a later date to the IRB for review and approval prior to any recruitment for this group beginning.</w:t>
+        <w:t/>
       </w:r>
       <w:commentRangeEnd w:id="0"/>
       <w:r>
@@ -564,7 +564,7 @@
           <w:rFonts w:cs="Times New Roman"/>
           <w:color w:val="000000" w:themeColor="text1"/>
         </w:rPr>
-        <w:t>1.2 Reflection group materials: icebreaker responses, meeting agenda notes including the end-of-cycle retrospective, individual written reflections, and notes and materials from whole-cohort activities and co-design sessions.</w:t>
+        <w:t>1.2 Reflection group materials: icebreaker responses, meeting agenda notes including the end-of-cycle retrospective, individual written reflections, and notes and materials from whole-cohort activities and other group activities.</w:t>
       </w:r>
     </w:p>
     <w:p>
@@ -1581,7 +1581,7 @@
           <w:rFonts w:cs="Times New Roman"/>
           <w:color w:val="000000" w:themeColor="text1"/>
         </w:rPr>
-        <w:t>In summary, the following data from participants who take part in the research will be retained indefinitely in de-identified form: intake survey responses (1.1), reflection group materials (1.2), follow-up survey responses (1.4), interview transcripts and notes (1.5). Original audio recordings are deleted as described above. For example, if a participant’s last interview is in March 2027, the recording is deleted by March 2028 and their email is deleted from the key file by January 2032 (five years after participation ends).</w:t>
+        <w:t>In summary, the following data from participants who take part in the research will be retained indefinitely in de-identified form: intake survey responses (1.1), reflection group materials (1.2), follow-up survey responses (1.3), interview transcripts and notes (1.4). Original audio recordings are deleted as described above. For example, if a participant’s last interview is in March 2027, the recording is deleted by March 2028 and their email is deleted from the key file by January 2032 (five years after participation ends).</w:t>
       </w:r>
       <w:r>
         <w:rPr>
@@ -2423,7 +2423,7 @@
             <w:rStyle w:val="Hyperlink"/>
             <w:rFonts w:cs="Times New Roman"/>
           </w:rPr>
-          <w:t>gregory.nelson@maine.edu</w:t>
+          <w:t/>
         </w:r>
       </w:hyperlink>
       <w:r>
@@ -2438,7 +2438,7 @@
             <w:rStyle w:val="Hyperlink"/>
             <w:rFonts w:cs="Times New Roman"/>
           </w:rPr>
-          <w:t>cyril.agbewalikoku@maine.edu</w:t>
+          <w:t/>
         </w:r>
       </w:hyperlink>
       <w:r>
@@ -2922,7 +2922,7 @@
             <w:rStyle w:val="Hyperlink"/>
             <w:rFonts w:cs="Times New Roman"/>
           </w:rPr>
-          <w:t>gregory.nelson@maine.edu</w:t>
+          <w:t/>
         </w:r>
       </w:hyperlink>
       <w:r>
@@ -2937,7 +2937,7 @@
             <w:rStyle w:val="Hyperlink"/>
             <w:rFonts w:cs="Times New Roman"/>
           </w:rPr>
-          <w:t>cyril.agbewalikoku@maine.edu</w:t>
+          <w:t/>
         </w:r>
       </w:hyperlink>
       <w:r>
@@ -4258,7 +4258,7 @@
           <w:rFonts w:cs="Times New Roman"/>
           <w:color w:val="000000" w:themeColor="text1"/>
         </w:rPr>
-        <w:t>8. The whole-cohort activities and any sessions where members suggested improvements to the reflection groups: what you took from them.</w:t>
+        <w:t>8. The whole-cohort activities and other group activities: what you took from them.</w:t>
       </w:r>
     </w:p>
     <w:p>
@@ -4381,7 +4381,7 @@
           <w:rFonts w:cs="Times New Roman"/>
           <w:color w:val="000000" w:themeColor="text1"/>
         </w:rPr>
-        <w:t>This reflection group is something we offer regardless of the research, and nothing about it changes based on what you decide here. What we are asking is whether we may also use the materials this group produces as research data: the intake survey you filled out when you joined, your icebreaker answers, the notes from our meetings, your individual reflections, and records of how you use the tool. We do not record meetings, and no researcher attends them other than for this announcement.</w:t>
+        <w:t>This reflection group is something we offer regardless of the research, and nothing about it changes based on what you decide here. What we are asking is whether we may also use the materials this group produces as research data: the intake survey you filled out when you joined, your icebreaker answers, the notes from our meetings, and your individual reflections. We do not record meetings, and no researcher attends them other than for this announcement.</w:t>
       </w:r>
     </w:p>
     <w:p>

</xml_diff>